<commit_message>
Replace vocab student with crop-verified words
</commit_message>
<xml_diff>
--- a/lesson7_vocab_student.docx
+++ b/lesson7_vocab_student.docx
@@ -205,7 +205,7 @@
                 <w:rFonts w:ascii="Calibri" w:hAnsi="Calibri"/>
                 <w:sz w:val="22"/>
               </w:rPr>
-              <w:t>pioneer</w:t>
+              <w:t>rules</w:t>
             </w:r>
           </w:p>
         </w:tc>
@@ -248,7 +248,7 @@
                 <w:rFonts w:ascii="Calibri" w:hAnsi="Calibri"/>
                 <w:sz w:val="22"/>
               </w:rPr>
-              <w:t>initiative</w:t>
+              <w:t>campaign</w:t>
             </w:r>
           </w:p>
         </w:tc>
@@ -291,7 +291,7 @@
                 <w:rFonts w:ascii="Calibri" w:hAnsi="Calibri"/>
                 <w:sz w:val="22"/>
               </w:rPr>
-              <w:t>stewardship</w:t>
+              <w:t>recycling</w:t>
             </w:r>
           </w:p>
         </w:tc>
@@ -807,7 +807,7 @@
                 <w:rFonts w:ascii="Calibri" w:hAnsi="Calibri"/>
                 <w:sz w:val="22"/>
               </w:rPr>
-              <w:t>undesirable</w:t>
+              <w:t>negative</w:t>
             </w:r>
           </w:p>
         </w:tc>
@@ -850,7 +850,7 @@
                 <w:rFonts w:ascii="Calibri" w:hAnsi="Calibri"/>
                 <w:sz w:val="22"/>
               </w:rPr>
-              <w:t>unwittingly</w:t>
+              <w:t>evidence</w:t>
             </w:r>
           </w:p>
         </w:tc>
@@ -1113,7 +1113,7 @@
                 <w:rFonts w:ascii="Calibri" w:hAnsi="Calibri"/>
                 <w:sz w:val="22"/>
               </w:rPr>
-              <w:t>the job of taking care of something important</w:t>
+              <w:t>acts of revealing or making something known</w:t>
             </w:r>
           </w:p>
         </w:tc>
@@ -1257,7 +1257,7 @@
                 <w:rFonts w:ascii="Calibri" w:hAnsi="Calibri"/>
                 <w:sz w:val="22"/>
               </w:rPr>
-              <w:t>without realizing or intending to do something</w:t>
+              <w:t>information or facts that show something is true</w:t>
             </w:r>
           </w:p>
         </w:tc>
@@ -1287,7 +1287,7 @@
                 <w:rFonts w:ascii="Calibri" w:hAnsi="Calibri"/>
                 <w:sz w:val="22"/>
               </w:rPr>
-              <w:t>not wanted or pleasing; negative</w:t>
+              <w:t>bad or harmful; expressing disagreement or refusal</w:t>
             </w:r>
           </w:p>
         </w:tc>
@@ -1373,7 +1373,7 @@
                 <w:rFonts w:ascii="Calibri" w:hAnsi="Calibri"/>
                 <w:sz w:val="22"/>
               </w:rPr>
-              <w:t>one of the first people to develop or do something new</w:t>
+              <w:t>the process of collecting waste and turning it into something new</w:t>
             </w:r>
           </w:p>
         </w:tc>
@@ -1547,7 +1547,7 @@
                 <w:rFonts w:ascii="Calibri" w:hAnsi="Calibri"/>
                 <w:sz w:val="22"/>
               </w:rPr>
-              <w:t>a new plan or action to achieve a goal</w:t>
+              <w:t>a planned set of activities to achieve a particular goal</w:t>
             </w:r>
           </w:p>
         </w:tc>
@@ -1605,7 +1605,7 @@
                 <w:rFonts w:ascii="Calibri" w:hAnsi="Calibri"/>
                 <w:sz w:val="22"/>
               </w:rPr>
-              <w:t>acts of revealing or making something known</w:t>
+              <w:t>instructions that tell you how to play a game or do something</w:t>
             </w:r>
           </w:p>
         </w:tc>

</xml_diff>

<commit_message>
Harder vocab words all from final 6 handout crops
</commit_message>
<xml_diff>
--- a/lesson7_vocab_student.docx
+++ b/lesson7_vocab_student.docx
@@ -3,9 +3,6 @@
 <w:document xmlns:wpc="http://schemas.microsoft.com/office/word/2010/wordprocessingCanvas" xmlns:mo="http://schemas.microsoft.com/office/mac/office/2008/main" xmlns:mc="http://schemas.openxmlformats.org/markup-compatibility/2006" xmlns:mv="urn:schemas-microsoft-com:mac:vml" xmlns:o="urn:schemas-microsoft-com:office:office" xmlns:r="http://schemas.openxmlformats.org/officeDocument/2006/relationships" xmlns:m="http://schemas.openxmlformats.org/officeDocument/2006/math" xmlns:v="urn:schemas-microsoft-com:vml" xmlns:wp14="http://schemas.microsoft.com/office/word/2010/wordprocessingDrawing" xmlns:wp="http://schemas.openxmlformats.org/drawingml/2006/wordprocessingDrawing" xmlns:w10="urn:schemas-microsoft-com:office:word" xmlns:w="http://schemas.openxmlformats.org/wordprocessingml/2006/main" xmlns:w14="http://schemas.microsoft.com/office/word/2010/wordml" xmlns:wpg="http://schemas.microsoft.com/office/word/2010/wordprocessingGroup" xmlns:wpi="http://schemas.microsoft.com/office/word/2010/wordprocessingInk" xmlns:wne="http://schemas.microsoft.com/office/word/2006/wordml" xmlns:wps="http://schemas.microsoft.com/office/word/2010/wordprocessingShape" mc:Ignorable="w14 wp14">
   <w:body>
     <w:p>
-      <w:pPr>
-        <w:jc w:val="left"/>
-      </w:pPr>
       <w:r>
         <w:rPr>
           <w:rFonts w:ascii="Calibri" w:hAnsi="Calibri"/>
@@ -162,7 +159,7 @@
                 <w:rFonts w:ascii="Calibri" w:hAnsi="Calibri"/>
                 <w:sz w:val="22"/>
               </w:rPr>
-              <w:t>challenging</w:t>
+              <w:t>narratives</w:t>
             </w:r>
           </w:p>
         </w:tc>
@@ -205,7 +202,7 @@
                 <w:rFonts w:ascii="Calibri" w:hAnsi="Calibri"/>
                 <w:sz w:val="22"/>
               </w:rPr>
-              <w:t>rules</w:t>
+              <w:t>instructions</w:t>
             </w:r>
           </w:p>
         </w:tc>
@@ -291,7 +288,7 @@
                 <w:rFonts w:ascii="Calibri" w:hAnsi="Calibri"/>
                 <w:sz w:val="22"/>
               </w:rPr>
-              <w:t>recycling</w:t>
+              <w:t>creativity</w:t>
             </w:r>
           </w:p>
         </w:tc>
@@ -377,7 +374,7 @@
                 <w:rFonts w:ascii="Calibri" w:hAnsi="Calibri"/>
                 <w:sz w:val="22"/>
               </w:rPr>
-              <w:t>volunteer</w:t>
+              <w:t>personality</w:t>
             </w:r>
           </w:p>
         </w:tc>
@@ -420,7 +417,7 @@
                 <w:rFonts w:ascii="Calibri" w:hAnsi="Calibri"/>
                 <w:sz w:val="22"/>
               </w:rPr>
-              <w:t>descent</w:t>
+              <w:t>consequences</w:t>
             </w:r>
           </w:p>
         </w:tc>
@@ -463,7 +460,7 @@
                 <w:rFonts w:ascii="Calibri" w:hAnsi="Calibri"/>
                 <w:sz w:val="22"/>
               </w:rPr>
-              <w:t>pressure</w:t>
+              <w:t>protective</w:t>
             </w:r>
           </w:p>
         </w:tc>
@@ -506,7 +503,7 @@
                 <w:rFonts w:ascii="Calibri" w:hAnsi="Calibri"/>
                 <w:sz w:val="22"/>
               </w:rPr>
-              <w:t>extracurricular</w:t>
+              <w:t>extensive</w:t>
             </w:r>
           </w:p>
         </w:tc>
@@ -764,7 +761,7 @@
                 <w:rFonts w:ascii="Calibri" w:hAnsi="Calibri"/>
                 <w:sz w:val="22"/>
               </w:rPr>
-              <w:t>representative</w:t>
+              <w:t>aftermath</w:t>
             </w:r>
           </w:p>
         </w:tc>
@@ -807,7 +804,7 @@
                 <w:rFonts w:ascii="Calibri" w:hAnsi="Calibri"/>
                 <w:sz w:val="22"/>
               </w:rPr>
-              <w:t>negative</w:t>
+              <w:t>desperation</w:t>
             </w:r>
           </w:p>
         </w:tc>
@@ -850,7 +847,7 @@
                 <w:rFonts w:ascii="Calibri" w:hAnsi="Calibri"/>
                 <w:sz w:val="22"/>
               </w:rPr>
-              <w:t>evidence</w:t>
+              <w:t>nocturnal</w:t>
             </w:r>
           </w:p>
         </w:tc>
@@ -1055,7 +1052,7 @@
                 <w:rFonts w:ascii="Calibri" w:hAnsi="Calibri"/>
                 <w:sz w:val="22"/>
               </w:rPr>
-              <w:t>difficult but interesting; testing your ability</w:t>
+              <w:t>brought into a country from another country</w:t>
             </w:r>
           </w:p>
         </w:tc>
@@ -1070,6 +1067,64 @@
                 <w:sz w:val="22"/>
               </w:rPr>
               <w:t>K</w:t>
+            </w:r>
+          </w:p>
+        </w:tc>
+        <w:tc>
+          <w:tcPr>
+            <w:tcW w:type="dxa" w:w="4752"/>
+          </w:tcPr>
+          <w:p>
+            <w:r>
+              <w:rPr>
+                <w:rFonts w:ascii="Calibri" w:hAnsi="Calibri"/>
+                <w:sz w:val="22"/>
+              </w:rPr>
+              <w:t>famous and admired by many people</w:t>
+            </w:r>
+          </w:p>
+        </w:tc>
+      </w:tr>
+      <w:tr>
+        <w:tc>
+          <w:tcPr>
+            <w:tcW w:type="dxa" w:w="720"/>
+          </w:tcPr>
+          <w:p>
+            <w:r>
+              <w:rPr>
+                <w:rFonts w:ascii="Calibri" w:hAnsi="Calibri"/>
+                <w:sz w:val="22"/>
+              </w:rPr>
+              <w:t>B</w:t>
+            </w:r>
+          </w:p>
+        </w:tc>
+        <w:tc>
+          <w:tcPr>
+            <w:tcW w:type="dxa" w:w="4752"/>
+          </w:tcPr>
+          <w:p>
+            <w:r>
+              <w:rPr>
+                <w:rFonts w:ascii="Calibri" w:hAnsi="Calibri"/>
+                <w:sz w:val="22"/>
+              </w:rPr>
+              <w:t>stories, or the way a story is told</w:t>
+            </w:r>
+          </w:p>
+        </w:tc>
+        <w:tc>
+          <w:tcPr>
+            <w:tcW w:type="dxa" w:w="720"/>
+          </w:tcPr>
+          <w:p>
+            <w:r>
+              <w:rPr>
+                <w:rFonts w:ascii="Calibri" w:hAnsi="Calibri"/>
+                <w:sz w:val="22"/>
+              </w:rPr>
+              <w:t>L</w:t>
             </w:r>
           </w:p>
         </w:tc>
@@ -1099,64 +1154,6 @@
                 <w:rFonts w:ascii="Calibri" w:hAnsi="Calibri"/>
                 <w:sz w:val="22"/>
               </w:rPr>
-              <w:t>B</w:t>
-            </w:r>
-          </w:p>
-        </w:tc>
-        <w:tc>
-          <w:tcPr>
-            <w:tcW w:type="dxa" w:w="4752"/>
-          </w:tcPr>
-          <w:p>
-            <w:r>
-              <w:rPr>
-                <w:rFonts w:ascii="Calibri" w:hAnsi="Calibri"/>
-                <w:sz w:val="22"/>
-              </w:rPr>
-              <w:t>acts of revealing or making something known</w:t>
-            </w:r>
-          </w:p>
-        </w:tc>
-        <w:tc>
-          <w:tcPr>
-            <w:tcW w:type="dxa" w:w="720"/>
-          </w:tcPr>
-          <w:p>
-            <w:r>
-              <w:rPr>
-                <w:rFonts w:ascii="Calibri" w:hAnsi="Calibri"/>
-                <w:sz w:val="22"/>
-              </w:rPr>
-              <w:t>L</w:t>
-            </w:r>
-          </w:p>
-        </w:tc>
-        <w:tc>
-          <w:tcPr>
-            <w:tcW w:type="dxa" w:w="4752"/>
-          </w:tcPr>
-          <w:p>
-            <w:r>
-              <w:rPr>
-                <w:rFonts w:ascii="Calibri" w:hAnsi="Calibri"/>
-                <w:sz w:val="22"/>
-              </w:rPr>
-              <w:t>a person who offers to do work without being paid</w:t>
-            </w:r>
-          </w:p>
-        </w:tc>
-      </w:tr>
-      <w:tr>
-        <w:tc>
-          <w:tcPr>
-            <w:tcW w:type="dxa" w:w="720"/>
-          </w:tcPr>
-          <w:p>
-            <w:r>
-              <w:rPr>
-                <w:rFonts w:ascii="Calibri" w:hAnsi="Calibri"/>
-                <w:sz w:val="22"/>
-              </w:rPr>
               <w:t>C</w:t>
             </w:r>
           </w:p>
@@ -1171,7 +1168,7 @@
                 <w:rFonts w:ascii="Calibri" w:hAnsi="Calibri"/>
                 <w:sz w:val="22"/>
               </w:rPr>
-              <w:t>a person's family origin or background</w:t>
+              <w:t>detailed information telling you how to do something</w:t>
             </w:r>
           </w:p>
         </w:tc>
@@ -1199,7 +1196,7 @@
                 <w:rFonts w:ascii="Calibri" w:hAnsi="Calibri"/>
                 <w:sz w:val="22"/>
               </w:rPr>
-              <w:t>a serious promise to do something</w:t>
+              <w:t>small broken pieces of something larger</w:t>
             </w:r>
           </w:p>
         </w:tc>
@@ -1229,7 +1226,7 @@
                 <w:rFonts w:ascii="Calibri" w:hAnsi="Calibri"/>
                 <w:sz w:val="22"/>
               </w:rPr>
-              <w:t>famous and admired by many people</w:t>
+              <w:t>a planned set of activities to achieve a goal</w:t>
             </w:r>
           </w:p>
         </w:tc>
@@ -1257,7 +1254,7 @@
                 <w:rFonts w:ascii="Calibri" w:hAnsi="Calibri"/>
                 <w:sz w:val="22"/>
               </w:rPr>
-              <w:t>information or facts that show something is true</w:t>
+              <w:t>dug out from the ground; discovered</w:t>
             </w:r>
           </w:p>
         </w:tc>
@@ -1287,7 +1284,7 @@
                 <w:rFonts w:ascii="Calibri" w:hAnsi="Calibri"/>
                 <w:sz w:val="22"/>
               </w:rPr>
-              <w:t>bad or harmful; expressing disagreement or refusal</w:t>
+              <w:t>the ability to produce new and original ideas</w:t>
             </w:r>
           </w:p>
         </w:tc>
@@ -1345,7 +1342,7 @@
                 <w:rFonts w:ascii="Calibri" w:hAnsi="Calibri"/>
                 <w:sz w:val="22"/>
               </w:rPr>
-              <w:t>something that stands for or symbolizes a larger group</w:t>
+              <w:t>a serious promise to do something</w:t>
             </w:r>
           </w:p>
         </w:tc>
@@ -1373,7 +1370,7 @@
                 <w:rFonts w:ascii="Calibri" w:hAnsi="Calibri"/>
                 <w:sz w:val="22"/>
               </w:rPr>
-              <w:t>the process of collecting waste and turning it into something new</w:t>
+              <w:t>the period following a damaging or important event</w:t>
             </w:r>
           </w:p>
         </w:tc>
@@ -1403,7 +1400,7 @@
                 <w:rFonts w:ascii="Calibri" w:hAnsi="Calibri"/>
                 <w:sz w:val="22"/>
               </w:rPr>
-              <w:t>brought into a country from another country</w:t>
+              <w:t>the combination of qualities that make someone different from others</w:t>
             </w:r>
           </w:p>
         </w:tc>
@@ -1431,7 +1428,7 @@
                 <w:rFonts w:ascii="Calibri" w:hAnsi="Calibri"/>
                 <w:sz w:val="22"/>
               </w:rPr>
-              <w:t>activities done outside regular school classes</w:t>
+              <w:t>a state of hopelessness and despair</w:t>
             </w:r>
           </w:p>
         </w:tc>
@@ -1461,7 +1458,7 @@
                 <w:rFonts w:ascii="Calibri" w:hAnsi="Calibri"/>
                 <w:sz w:val="22"/>
               </w:rPr>
-              <w:t>small broken pieces of something larger</w:t>
+              <w:t>results or effects of an action</w:t>
             </w:r>
           </w:p>
         </w:tc>
@@ -1489,7 +1486,7 @@
                 <w:rFonts w:ascii="Calibri" w:hAnsi="Calibri"/>
                 <w:sz w:val="22"/>
               </w:rPr>
-              <w:t>dug out from the ground; discovered</w:t>
+              <w:t>active during the night</w:t>
             </w:r>
           </w:p>
         </w:tc>
@@ -1519,7 +1516,7 @@
                 <w:rFonts w:ascii="Calibri" w:hAnsi="Calibri"/>
                 <w:sz w:val="22"/>
               </w:rPr>
-              <w:t>force or stress put on someone to do something</w:t>
+              <w:t>intended to keep someone safe from harm or damage</w:t>
             </w:r>
           </w:p>
         </w:tc>
@@ -1547,7 +1544,7 @@
                 <w:rFonts w:ascii="Calibri" w:hAnsi="Calibri"/>
                 <w:sz w:val="22"/>
               </w:rPr>
-              <w:t>a planned set of activities to achieve a particular goal</w:t>
+              <w:t>acts of revealing or making something known</w:t>
             </w:r>
           </w:p>
         </w:tc>
@@ -1577,7 +1574,7 @@
                 <w:rFonts w:ascii="Calibri" w:hAnsi="Calibri"/>
                 <w:sz w:val="22"/>
               </w:rPr>
-              <w:t>causing a strong need to keep using or doing something</w:t>
+              <w:t>covering a large area or a wide range</w:t>
             </w:r>
           </w:p>
         </w:tc>
@@ -1605,7 +1602,7 @@
                 <w:rFonts w:ascii="Calibri" w:hAnsi="Calibri"/>
                 <w:sz w:val="22"/>
               </w:rPr>
-              <w:t>instructions that tell you how to play a game or do something</w:t>
+              <w:t>causing a strong need to keep using or doing something</w:t>
             </w:r>
           </w:p>
         </w:tc>

</xml_diff>

<commit_message>
Shuffle definition letter order
</commit_message>
<xml_diff>
--- a/lesson7_vocab_student.docx
+++ b/lesson7_vocab_student.docx
@@ -1038,7 +1038,7 @@
                 <w:rFonts w:ascii="Calibri" w:hAnsi="Calibri"/>
                 <w:sz w:val="22"/>
               </w:rPr>
-              <w:t>A</w:t>
+              <w:t>T</w:t>
             </w:r>
           </w:p>
         </w:tc>
@@ -1052,7 +1052,65 @@
                 <w:rFonts w:ascii="Calibri" w:hAnsi="Calibri"/>
                 <w:sz w:val="22"/>
               </w:rPr>
-              <w:t>brought into a country from another country</w:t>
+              <w:t>causing a strong need to keep using or doing something</w:t>
+            </w:r>
+          </w:p>
+        </w:tc>
+        <w:tc>
+          <w:tcPr>
+            <w:tcW w:type="dxa" w:w="720"/>
+          </w:tcPr>
+          <w:p>
+            <w:r>
+              <w:rPr>
+                <w:rFonts w:ascii="Calibri" w:hAnsi="Calibri"/>
+                <w:sz w:val="22"/>
+              </w:rPr>
+              <w:t>R</w:t>
+            </w:r>
+          </w:p>
+        </w:tc>
+        <w:tc>
+          <w:tcPr>
+            <w:tcW w:type="dxa" w:w="4752"/>
+          </w:tcPr>
+          <w:p>
+            <w:r>
+              <w:rPr>
+                <w:rFonts w:ascii="Calibri" w:hAnsi="Calibri"/>
+                <w:sz w:val="22"/>
+              </w:rPr>
+              <w:t>active during the night</w:t>
+            </w:r>
+          </w:p>
+        </w:tc>
+      </w:tr>
+      <w:tr>
+        <w:tc>
+          <w:tcPr>
+            <w:tcW w:type="dxa" w:w="720"/>
+          </w:tcPr>
+          <w:p>
+            <w:r>
+              <w:rPr>
+                <w:rFonts w:ascii="Calibri" w:hAnsi="Calibri"/>
+                <w:sz w:val="22"/>
+              </w:rPr>
+              <w:t>F</w:t>
+            </w:r>
+          </w:p>
+        </w:tc>
+        <w:tc>
+          <w:tcPr>
+            <w:tcW w:type="dxa" w:w="4752"/>
+          </w:tcPr>
+          <w:p>
+            <w:r>
+              <w:rPr>
+                <w:rFonts w:ascii="Calibri" w:hAnsi="Calibri"/>
+                <w:sz w:val="22"/>
+              </w:rPr>
+              <w:t>a serious promise to do something</w:t>
             </w:r>
           </w:p>
         </w:tc>
@@ -1096,6 +1154,34 @@
                 <w:rFonts w:ascii="Calibri" w:hAnsi="Calibri"/>
                 <w:sz w:val="22"/>
               </w:rPr>
+              <w:t>O</w:t>
+            </w:r>
+          </w:p>
+        </w:tc>
+        <w:tc>
+          <w:tcPr>
+            <w:tcW w:type="dxa" w:w="4752"/>
+          </w:tcPr>
+          <w:p>
+            <w:r>
+              <w:rPr>
+                <w:rFonts w:ascii="Calibri" w:hAnsi="Calibri"/>
+                <w:sz w:val="22"/>
+              </w:rPr>
+              <w:t>the act of digging to find things underground</w:t>
+            </w:r>
+          </w:p>
+        </w:tc>
+        <w:tc>
+          <w:tcPr>
+            <w:tcW w:type="dxa" w:w="720"/>
+          </w:tcPr>
+          <w:p>
+            <w:r>
+              <w:rPr>
+                <w:rFonts w:ascii="Calibri" w:hAnsi="Calibri"/>
+                <w:sz w:val="22"/>
+              </w:rPr>
               <w:t>B</w:t>
             </w:r>
           </w:p>
@@ -1111,6 +1197,36 @@
                 <w:sz w:val="22"/>
               </w:rPr>
               <w:t>stories, or the way a story is told</w:t>
+            </w:r>
+          </w:p>
+        </w:tc>
+      </w:tr>
+      <w:tr>
+        <w:tc>
+          <w:tcPr>
+            <w:tcW w:type="dxa" w:w="720"/>
+          </w:tcPr>
+          <w:p>
+            <w:r>
+              <w:rPr>
+                <w:rFonts w:ascii="Calibri" w:hAnsi="Calibri"/>
+                <w:sz w:val="22"/>
+              </w:rPr>
+              <w:t>E</w:t>
+            </w:r>
+          </w:p>
+        </w:tc>
+        <w:tc>
+          <w:tcPr>
+            <w:tcW w:type="dxa" w:w="4752"/>
+          </w:tcPr>
+          <w:p>
+            <w:r>
+              <w:rPr>
+                <w:rFonts w:ascii="Calibri" w:hAnsi="Calibri"/>
+                <w:sz w:val="22"/>
+              </w:rPr>
+              <w:t>the ability to produce new and original ideas</w:t>
             </w:r>
           </w:p>
         </w:tc>
@@ -1154,6 +1270,34 @@
                 <w:rFonts w:ascii="Calibri" w:hAnsi="Calibri"/>
                 <w:sz w:val="22"/>
               </w:rPr>
+              <w:t>J</w:t>
+            </w:r>
+          </w:p>
+        </w:tc>
+        <w:tc>
+          <w:tcPr>
+            <w:tcW w:type="dxa" w:w="4752"/>
+          </w:tcPr>
+          <w:p>
+            <w:r>
+              <w:rPr>
+                <w:rFonts w:ascii="Calibri" w:hAnsi="Calibri"/>
+                <w:sz w:val="22"/>
+              </w:rPr>
+              <w:t>covering a large area or a wide range</w:t>
+            </w:r>
+          </w:p>
+        </w:tc>
+        <w:tc>
+          <w:tcPr>
+            <w:tcW w:type="dxa" w:w="720"/>
+          </w:tcPr>
+          <w:p>
+            <w:r>
+              <w:rPr>
+                <w:rFonts w:ascii="Calibri" w:hAnsi="Calibri"/>
+                <w:sz w:val="22"/>
+              </w:rPr>
               <w:t>C</w:t>
             </w:r>
           </w:p>
@@ -1172,64 +1316,8 @@
             </w:r>
           </w:p>
         </w:tc>
-        <w:tc>
-          <w:tcPr>
-            <w:tcW w:type="dxa" w:w="720"/>
-          </w:tcPr>
-          <w:p>
-            <w:r>
-              <w:rPr>
-                <w:rFonts w:ascii="Calibri" w:hAnsi="Calibri"/>
-                <w:sz w:val="22"/>
-              </w:rPr>
-              <w:t>M</w:t>
-            </w:r>
-          </w:p>
-        </w:tc>
-        <w:tc>
-          <w:tcPr>
-            <w:tcW w:type="dxa" w:w="4752"/>
-          </w:tcPr>
-          <w:p>
-            <w:r>
-              <w:rPr>
-                <w:rFonts w:ascii="Calibri" w:hAnsi="Calibri"/>
-                <w:sz w:val="22"/>
-              </w:rPr>
-              <w:t>small broken pieces of something larger</w:t>
-            </w:r>
-          </w:p>
-        </w:tc>
       </w:tr>
       <w:tr>
-        <w:tc>
-          <w:tcPr>
-            <w:tcW w:type="dxa" w:w="720"/>
-          </w:tcPr>
-          <w:p>
-            <w:r>
-              <w:rPr>
-                <w:rFonts w:ascii="Calibri" w:hAnsi="Calibri"/>
-                <w:sz w:val="22"/>
-              </w:rPr>
-              <w:t>D</w:t>
-            </w:r>
-          </w:p>
-        </w:tc>
-        <w:tc>
-          <w:tcPr>
-            <w:tcW w:type="dxa" w:w="4752"/>
-          </w:tcPr>
-          <w:p>
-            <w:r>
-              <w:rPr>
-                <w:rFonts w:ascii="Calibri" w:hAnsi="Calibri"/>
-                <w:sz w:val="22"/>
-              </w:rPr>
-              <w:t>a planned set of activities to achieve a goal</w:t>
-            </w:r>
-          </w:p>
-        </w:tc>
         <w:tc>
           <w:tcPr>
             <w:tcW w:type="dxa" w:w="720"/>
@@ -1258,8 +1346,6 @@
             </w:r>
           </w:p>
         </w:tc>
-      </w:tr>
-      <w:tr>
         <w:tc>
           <w:tcPr>
             <w:tcW w:type="dxa" w:w="720"/>
@@ -1270,7 +1356,7 @@
                 <w:rFonts w:ascii="Calibri" w:hAnsi="Calibri"/>
                 <w:sz w:val="22"/>
               </w:rPr>
-              <w:t>E</w:t>
+              <w:t>Q</w:t>
             </w:r>
           </w:p>
         </w:tc>
@@ -1284,68 +1370,12 @@
                 <w:rFonts w:ascii="Calibri" w:hAnsi="Calibri"/>
                 <w:sz w:val="22"/>
               </w:rPr>
-              <w:t>the ability to produce new and original ideas</w:t>
-            </w:r>
-          </w:p>
-        </w:tc>
-        <w:tc>
-          <w:tcPr>
-            <w:tcW w:type="dxa" w:w="720"/>
-          </w:tcPr>
-          <w:p>
-            <w:r>
-              <w:rPr>
-                <w:rFonts w:ascii="Calibri" w:hAnsi="Calibri"/>
-                <w:sz w:val="22"/>
-              </w:rPr>
-              <w:t>O</w:t>
-            </w:r>
-          </w:p>
-        </w:tc>
-        <w:tc>
-          <w:tcPr>
-            <w:tcW w:type="dxa" w:w="4752"/>
-          </w:tcPr>
-          <w:p>
-            <w:r>
-              <w:rPr>
-                <w:rFonts w:ascii="Calibri" w:hAnsi="Calibri"/>
-                <w:sz w:val="22"/>
-              </w:rPr>
-              <w:t>the act of digging to find things underground</w:t>
+              <w:t>a state of hopelessness and despair</w:t>
             </w:r>
           </w:p>
         </w:tc>
       </w:tr>
       <w:tr>
-        <w:tc>
-          <w:tcPr>
-            <w:tcW w:type="dxa" w:w="720"/>
-          </w:tcPr>
-          <w:p>
-            <w:r>
-              <w:rPr>
-                <w:rFonts w:ascii="Calibri" w:hAnsi="Calibri"/>
-                <w:sz w:val="22"/>
-              </w:rPr>
-              <w:t>F</w:t>
-            </w:r>
-          </w:p>
-        </w:tc>
-        <w:tc>
-          <w:tcPr>
-            <w:tcW w:type="dxa" w:w="4752"/>
-          </w:tcPr>
-          <w:p>
-            <w:r>
-              <w:rPr>
-                <w:rFonts w:ascii="Calibri" w:hAnsi="Calibri"/>
-                <w:sz w:val="22"/>
-              </w:rPr>
-              <w:t>a serious promise to do something</w:t>
-            </w:r>
-          </w:p>
-        </w:tc>
         <w:tc>
           <w:tcPr>
             <w:tcW w:type="dxa" w:w="720"/>
@@ -1371,6 +1401,92 @@
                 <w:sz w:val="22"/>
               </w:rPr>
               <w:t>the period following a damaging or important event</w:t>
+            </w:r>
+          </w:p>
+        </w:tc>
+        <w:tc>
+          <w:tcPr>
+            <w:tcW w:type="dxa" w:w="720"/>
+          </w:tcPr>
+          <w:p>
+            <w:r>
+              <w:rPr>
+                <w:rFonts w:ascii="Calibri" w:hAnsi="Calibri"/>
+                <w:sz w:val="22"/>
+              </w:rPr>
+              <w:t>H</w:t>
+            </w:r>
+          </w:p>
+        </w:tc>
+        <w:tc>
+          <w:tcPr>
+            <w:tcW w:type="dxa" w:w="4752"/>
+          </w:tcPr>
+          <w:p>
+            <w:r>
+              <w:rPr>
+                <w:rFonts w:ascii="Calibri" w:hAnsi="Calibri"/>
+                <w:sz w:val="22"/>
+              </w:rPr>
+              <w:t>results or effects of an action</w:t>
+            </w:r>
+          </w:p>
+        </w:tc>
+      </w:tr>
+      <w:tr>
+        <w:tc>
+          <w:tcPr>
+            <w:tcW w:type="dxa" w:w="720"/>
+          </w:tcPr>
+          <w:p>
+            <w:r>
+              <w:rPr>
+                <w:rFonts w:ascii="Calibri" w:hAnsi="Calibri"/>
+                <w:sz w:val="22"/>
+              </w:rPr>
+              <w:t>S</w:t>
+            </w:r>
+          </w:p>
+        </w:tc>
+        <w:tc>
+          <w:tcPr>
+            <w:tcW w:type="dxa" w:w="4752"/>
+          </w:tcPr>
+          <w:p>
+            <w:r>
+              <w:rPr>
+                <w:rFonts w:ascii="Calibri" w:hAnsi="Calibri"/>
+                <w:sz w:val="22"/>
+              </w:rPr>
+              <w:t>acts of revealing or making something known</w:t>
+            </w:r>
+          </w:p>
+        </w:tc>
+        <w:tc>
+          <w:tcPr>
+            <w:tcW w:type="dxa" w:w="720"/>
+          </w:tcPr>
+          <w:p>
+            <w:r>
+              <w:rPr>
+                <w:rFonts w:ascii="Calibri" w:hAnsi="Calibri"/>
+                <w:sz w:val="22"/>
+              </w:rPr>
+              <w:t>I</w:t>
+            </w:r>
+          </w:p>
+        </w:tc>
+        <w:tc>
+          <w:tcPr>
+            <w:tcW w:type="dxa" w:w="4752"/>
+          </w:tcPr>
+          <w:p>
+            <w:r>
+              <w:rPr>
+                <w:rFonts w:ascii="Calibri" w:hAnsi="Calibri"/>
+                <w:sz w:val="22"/>
+              </w:rPr>
+              <w:t>intended to keep someone safe from harm or damage</w:t>
             </w:r>
           </w:p>
         </w:tc>
@@ -1414,7 +1530,7 @@
                 <w:rFonts w:ascii="Calibri" w:hAnsi="Calibri"/>
                 <w:sz w:val="22"/>
               </w:rPr>
-              <w:t>Q</w:t>
+              <w:t>A</w:t>
             </w:r>
           </w:p>
         </w:tc>
@@ -1428,7 +1544,7 @@
                 <w:rFonts w:ascii="Calibri" w:hAnsi="Calibri"/>
                 <w:sz w:val="22"/>
               </w:rPr>
-              <w:t>a state of hopelessness and despair</w:t>
+              <w:t>brought into a country from another country</w:t>
             </w:r>
           </w:p>
         </w:tc>
@@ -1444,7 +1560,7 @@
                 <w:rFonts w:ascii="Calibri" w:hAnsi="Calibri"/>
                 <w:sz w:val="22"/>
               </w:rPr>
-              <w:t>H</w:t>
+              <w:t>M</w:t>
             </w:r>
           </w:p>
         </w:tc>
@@ -1458,7 +1574,7 @@
                 <w:rFonts w:ascii="Calibri" w:hAnsi="Calibri"/>
                 <w:sz w:val="22"/>
               </w:rPr>
-              <w:t>results or effects of an action</w:t>
+              <w:t>small broken pieces of something larger</w:t>
             </w:r>
           </w:p>
         </w:tc>
@@ -1472,7 +1588,7 @@
                 <w:rFonts w:ascii="Calibri" w:hAnsi="Calibri"/>
                 <w:sz w:val="22"/>
               </w:rPr>
-              <w:t>R</w:t>
+              <w:t>D</w:t>
             </w:r>
           </w:p>
         </w:tc>
@@ -1486,123 +1602,7 @@
                 <w:rFonts w:ascii="Calibri" w:hAnsi="Calibri"/>
                 <w:sz w:val="22"/>
               </w:rPr>
-              <w:t>active during the night</w:t>
-            </w:r>
-          </w:p>
-        </w:tc>
-      </w:tr>
-      <w:tr>
-        <w:tc>
-          <w:tcPr>
-            <w:tcW w:type="dxa" w:w="720"/>
-          </w:tcPr>
-          <w:p>
-            <w:r>
-              <w:rPr>
-                <w:rFonts w:ascii="Calibri" w:hAnsi="Calibri"/>
-                <w:sz w:val="22"/>
-              </w:rPr>
-              <w:t>I</w:t>
-            </w:r>
-          </w:p>
-        </w:tc>
-        <w:tc>
-          <w:tcPr>
-            <w:tcW w:type="dxa" w:w="4752"/>
-          </w:tcPr>
-          <w:p>
-            <w:r>
-              <w:rPr>
-                <w:rFonts w:ascii="Calibri" w:hAnsi="Calibri"/>
-                <w:sz w:val="22"/>
-              </w:rPr>
-              <w:t>intended to keep someone safe from harm or damage</w:t>
-            </w:r>
-          </w:p>
-        </w:tc>
-        <w:tc>
-          <w:tcPr>
-            <w:tcW w:type="dxa" w:w="720"/>
-          </w:tcPr>
-          <w:p>
-            <w:r>
-              <w:rPr>
-                <w:rFonts w:ascii="Calibri" w:hAnsi="Calibri"/>
-                <w:sz w:val="22"/>
-              </w:rPr>
-              <w:t>S</w:t>
-            </w:r>
-          </w:p>
-        </w:tc>
-        <w:tc>
-          <w:tcPr>
-            <w:tcW w:type="dxa" w:w="4752"/>
-          </w:tcPr>
-          <w:p>
-            <w:r>
-              <w:rPr>
-                <w:rFonts w:ascii="Calibri" w:hAnsi="Calibri"/>
-                <w:sz w:val="22"/>
-              </w:rPr>
-              <w:t>acts of revealing or making something known</w:t>
-            </w:r>
-          </w:p>
-        </w:tc>
-      </w:tr>
-      <w:tr>
-        <w:tc>
-          <w:tcPr>
-            <w:tcW w:type="dxa" w:w="720"/>
-          </w:tcPr>
-          <w:p>
-            <w:r>
-              <w:rPr>
-                <w:rFonts w:ascii="Calibri" w:hAnsi="Calibri"/>
-                <w:sz w:val="22"/>
-              </w:rPr>
-              <w:t>J</w:t>
-            </w:r>
-          </w:p>
-        </w:tc>
-        <w:tc>
-          <w:tcPr>
-            <w:tcW w:type="dxa" w:w="4752"/>
-          </w:tcPr>
-          <w:p>
-            <w:r>
-              <w:rPr>
-                <w:rFonts w:ascii="Calibri" w:hAnsi="Calibri"/>
-                <w:sz w:val="22"/>
-              </w:rPr>
-              <w:t>covering a large area or a wide range</w:t>
-            </w:r>
-          </w:p>
-        </w:tc>
-        <w:tc>
-          <w:tcPr>
-            <w:tcW w:type="dxa" w:w="720"/>
-          </w:tcPr>
-          <w:p>
-            <w:r>
-              <w:rPr>
-                <w:rFonts w:ascii="Calibri" w:hAnsi="Calibri"/>
-                <w:sz w:val="22"/>
-              </w:rPr>
-              <w:t>T</w:t>
-            </w:r>
-          </w:p>
-        </w:tc>
-        <w:tc>
-          <w:tcPr>
-            <w:tcW w:type="dxa" w:w="4752"/>
-          </w:tcPr>
-          <w:p>
-            <w:r>
-              <w:rPr>
-                <w:rFonts w:ascii="Calibri" w:hAnsi="Calibri"/>
-                <w:sz w:val="22"/>
-              </w:rPr>
-              <w:t>causing a strong need to keep using or doing something</w:t>
+              <w:t>a planned set of activities to achieve a goal</w:t>
             </w:r>
           </w:p>
         </w:tc>

</xml_diff>

<commit_message>
Fix shuffle: answer key shows letter + correct definition
</commit_message>
<xml_diff>
--- a/lesson7_vocab_student.docx
+++ b/lesson7_vocab_student.docx
@@ -1038,7 +1038,181 @@
                 <w:rFonts w:ascii="Calibri" w:hAnsi="Calibri"/>
                 <w:sz w:val="22"/>
               </w:rPr>
-              <w:t>T</w:t>
+              <w:t>A</w:t>
+            </w:r>
+          </w:p>
+        </w:tc>
+        <w:tc>
+          <w:tcPr>
+            <w:tcW w:type="dxa" w:w="4752"/>
+          </w:tcPr>
+          <w:p>
+            <w:r>
+              <w:rPr>
+                <w:rFonts w:ascii="Calibri" w:hAnsi="Calibri"/>
+                <w:sz w:val="22"/>
+              </w:rPr>
+              <w:t>acts of revealing or making something known</w:t>
+            </w:r>
+          </w:p>
+        </w:tc>
+        <w:tc>
+          <w:tcPr>
+            <w:tcW w:type="dxa" w:w="720"/>
+          </w:tcPr>
+          <w:p>
+            <w:r>
+              <w:rPr>
+                <w:rFonts w:ascii="Calibri" w:hAnsi="Calibri"/>
+                <w:sz w:val="22"/>
+              </w:rPr>
+              <w:t>K</w:t>
+            </w:r>
+          </w:p>
+        </w:tc>
+        <w:tc>
+          <w:tcPr>
+            <w:tcW w:type="dxa" w:w="4752"/>
+          </w:tcPr>
+          <w:p>
+            <w:r>
+              <w:rPr>
+                <w:rFonts w:ascii="Calibri" w:hAnsi="Calibri"/>
+                <w:sz w:val="22"/>
+              </w:rPr>
+              <w:t>not clearly or fully known</w:t>
+            </w:r>
+          </w:p>
+        </w:tc>
+      </w:tr>
+      <w:tr>
+        <w:tc>
+          <w:tcPr>
+            <w:tcW w:type="dxa" w:w="720"/>
+          </w:tcPr>
+          <w:p>
+            <w:r>
+              <w:rPr>
+                <w:rFonts w:ascii="Calibri" w:hAnsi="Calibri"/>
+                <w:sz w:val="22"/>
+              </w:rPr>
+              <w:t>B</w:t>
+            </w:r>
+          </w:p>
+        </w:tc>
+        <w:tc>
+          <w:tcPr>
+            <w:tcW w:type="dxa" w:w="4752"/>
+          </w:tcPr>
+          <w:p>
+            <w:r>
+              <w:rPr>
+                <w:rFonts w:ascii="Calibri" w:hAnsi="Calibri"/>
+                <w:sz w:val="22"/>
+              </w:rPr>
+              <w:t>small broken pieces of something larger</w:t>
+            </w:r>
+          </w:p>
+        </w:tc>
+        <w:tc>
+          <w:tcPr>
+            <w:tcW w:type="dxa" w:w="720"/>
+          </w:tcPr>
+          <w:p>
+            <w:r>
+              <w:rPr>
+                <w:rFonts w:ascii="Calibri" w:hAnsi="Calibri"/>
+                <w:sz w:val="22"/>
+              </w:rPr>
+              <w:t>L</w:t>
+            </w:r>
+          </w:p>
+        </w:tc>
+        <w:tc>
+          <w:tcPr>
+            <w:tcW w:type="dxa" w:w="4752"/>
+          </w:tcPr>
+          <w:p>
+            <w:r>
+              <w:rPr>
+                <w:rFonts w:ascii="Calibri" w:hAnsi="Calibri"/>
+                <w:sz w:val="22"/>
+              </w:rPr>
+              <w:t>dug out from the ground; discovered</w:t>
+            </w:r>
+          </w:p>
+        </w:tc>
+      </w:tr>
+      <w:tr>
+        <w:tc>
+          <w:tcPr>
+            <w:tcW w:type="dxa" w:w="720"/>
+          </w:tcPr>
+          <w:p>
+            <w:r>
+              <w:rPr>
+                <w:rFonts w:ascii="Calibri" w:hAnsi="Calibri"/>
+                <w:sz w:val="22"/>
+              </w:rPr>
+              <w:t>C</w:t>
+            </w:r>
+          </w:p>
+        </w:tc>
+        <w:tc>
+          <w:tcPr>
+            <w:tcW w:type="dxa" w:w="4752"/>
+          </w:tcPr>
+          <w:p>
+            <w:r>
+              <w:rPr>
+                <w:rFonts w:ascii="Calibri" w:hAnsi="Calibri"/>
+                <w:sz w:val="22"/>
+              </w:rPr>
+              <w:t>the act of digging to find things underground</w:t>
+            </w:r>
+          </w:p>
+        </w:tc>
+        <w:tc>
+          <w:tcPr>
+            <w:tcW w:type="dxa" w:w="720"/>
+          </w:tcPr>
+          <w:p>
+            <w:r>
+              <w:rPr>
+                <w:rFonts w:ascii="Calibri" w:hAnsi="Calibri"/>
+                <w:sz w:val="22"/>
+              </w:rPr>
+              <w:t>M</w:t>
+            </w:r>
+          </w:p>
+        </w:tc>
+        <w:tc>
+          <w:tcPr>
+            <w:tcW w:type="dxa" w:w="4752"/>
+          </w:tcPr>
+          <w:p>
+            <w:r>
+              <w:rPr>
+                <w:rFonts w:ascii="Calibri" w:hAnsi="Calibri"/>
+                <w:sz w:val="22"/>
+              </w:rPr>
+              <w:t>covering a large area or a wide range</w:t>
+            </w:r>
+          </w:p>
+        </w:tc>
+      </w:tr>
+      <w:tr>
+        <w:tc>
+          <w:tcPr>
+            <w:tcW w:type="dxa" w:w="720"/>
+          </w:tcPr>
+          <w:p>
+            <w:r>
+              <w:rPr>
+                <w:rFonts w:ascii="Calibri" w:hAnsi="Calibri"/>
+                <w:sz w:val="22"/>
+              </w:rPr>
+              <w:t>D</w:t>
             </w:r>
           </w:p>
         </w:tc>
@@ -1066,7 +1240,7 @@
                 <w:rFonts w:ascii="Calibri" w:hAnsi="Calibri"/>
                 <w:sz w:val="22"/>
               </w:rPr>
-              <w:t>R</w:t>
+              <w:t>N</w:t>
             </w:r>
           </w:p>
         </w:tc>
@@ -1080,7 +1254,65 @@
                 <w:rFonts w:ascii="Calibri" w:hAnsi="Calibri"/>
                 <w:sz w:val="22"/>
               </w:rPr>
-              <w:t>active during the night</w:t>
+              <w:t>a serious promise to do something</w:t>
+            </w:r>
+          </w:p>
+        </w:tc>
+      </w:tr>
+      <w:tr>
+        <w:tc>
+          <w:tcPr>
+            <w:tcW w:type="dxa" w:w="720"/>
+          </w:tcPr>
+          <w:p>
+            <w:r>
+              <w:rPr>
+                <w:rFonts w:ascii="Calibri" w:hAnsi="Calibri"/>
+                <w:sz w:val="22"/>
+              </w:rPr>
+              <w:t>E</w:t>
+            </w:r>
+          </w:p>
+        </w:tc>
+        <w:tc>
+          <w:tcPr>
+            <w:tcW w:type="dxa" w:w="4752"/>
+          </w:tcPr>
+          <w:p>
+            <w:r>
+              <w:rPr>
+                <w:rFonts w:ascii="Calibri" w:hAnsi="Calibri"/>
+                <w:sz w:val="22"/>
+              </w:rPr>
+              <w:t>a planned set of activities to achieve a goal</w:t>
+            </w:r>
+          </w:p>
+        </w:tc>
+        <w:tc>
+          <w:tcPr>
+            <w:tcW w:type="dxa" w:w="720"/>
+          </w:tcPr>
+          <w:p>
+            <w:r>
+              <w:rPr>
+                <w:rFonts w:ascii="Calibri" w:hAnsi="Calibri"/>
+                <w:sz w:val="22"/>
+              </w:rPr>
+              <w:t>O</w:t>
+            </w:r>
+          </w:p>
+        </w:tc>
+        <w:tc>
+          <w:tcPr>
+            <w:tcW w:type="dxa" w:w="4752"/>
+          </w:tcPr>
+          <w:p>
+            <w:r>
+              <w:rPr>
+                <w:rFonts w:ascii="Calibri" w:hAnsi="Calibri"/>
+                <w:sz w:val="22"/>
+              </w:rPr>
+              <w:t>detailed information telling you how to do something</w:t>
             </w:r>
           </w:p>
         </w:tc>
@@ -1110,7 +1342,7 @@
                 <w:rFonts w:ascii="Calibri" w:hAnsi="Calibri"/>
                 <w:sz w:val="22"/>
               </w:rPr>
-              <w:t>a serious promise to do something</w:t>
+              <w:t>stories, or the way a story is told</w:t>
             </w:r>
           </w:p>
         </w:tc>
@@ -1124,7 +1356,123 @@
                 <w:rFonts w:ascii="Calibri" w:hAnsi="Calibri"/>
                 <w:sz w:val="22"/>
               </w:rPr>
-              <w:t>K</w:t>
+              <w:t>P</w:t>
+            </w:r>
+          </w:p>
+        </w:tc>
+        <w:tc>
+          <w:tcPr>
+            <w:tcW w:type="dxa" w:w="4752"/>
+          </w:tcPr>
+          <w:p>
+            <w:r>
+              <w:rPr>
+                <w:rFonts w:ascii="Calibri" w:hAnsi="Calibri"/>
+                <w:sz w:val="22"/>
+              </w:rPr>
+              <w:t>the combination of qualities that make someone different from others</w:t>
+            </w:r>
+          </w:p>
+        </w:tc>
+      </w:tr>
+      <w:tr>
+        <w:tc>
+          <w:tcPr>
+            <w:tcW w:type="dxa" w:w="720"/>
+          </w:tcPr>
+          <w:p>
+            <w:r>
+              <w:rPr>
+                <w:rFonts w:ascii="Calibri" w:hAnsi="Calibri"/>
+                <w:sz w:val="22"/>
+              </w:rPr>
+              <w:t>G</w:t>
+            </w:r>
+          </w:p>
+        </w:tc>
+        <w:tc>
+          <w:tcPr>
+            <w:tcW w:type="dxa" w:w="4752"/>
+          </w:tcPr>
+          <w:p>
+            <w:r>
+              <w:rPr>
+                <w:rFonts w:ascii="Calibri" w:hAnsi="Calibri"/>
+                <w:sz w:val="22"/>
+              </w:rPr>
+              <w:t>intended to keep someone safe from harm or damage</w:t>
+            </w:r>
+          </w:p>
+        </w:tc>
+        <w:tc>
+          <w:tcPr>
+            <w:tcW w:type="dxa" w:w="720"/>
+          </w:tcPr>
+          <w:p>
+            <w:r>
+              <w:rPr>
+                <w:rFonts w:ascii="Calibri" w:hAnsi="Calibri"/>
+                <w:sz w:val="22"/>
+              </w:rPr>
+              <w:t>Q</w:t>
+            </w:r>
+          </w:p>
+        </w:tc>
+        <w:tc>
+          <w:tcPr>
+            <w:tcW w:type="dxa" w:w="4752"/>
+          </w:tcPr>
+          <w:p>
+            <w:r>
+              <w:rPr>
+                <w:rFonts w:ascii="Calibri" w:hAnsi="Calibri"/>
+                <w:sz w:val="22"/>
+              </w:rPr>
+              <w:t>the period following a damaging or important event</w:t>
+            </w:r>
+          </w:p>
+        </w:tc>
+      </w:tr>
+      <w:tr>
+        <w:tc>
+          <w:tcPr>
+            <w:tcW w:type="dxa" w:w="720"/>
+          </w:tcPr>
+          <w:p>
+            <w:r>
+              <w:rPr>
+                <w:rFonts w:ascii="Calibri" w:hAnsi="Calibri"/>
+                <w:sz w:val="22"/>
+              </w:rPr>
+              <w:t>H</w:t>
+            </w:r>
+          </w:p>
+        </w:tc>
+        <w:tc>
+          <w:tcPr>
+            <w:tcW w:type="dxa" w:w="4752"/>
+          </w:tcPr>
+          <w:p>
+            <w:r>
+              <w:rPr>
+                <w:rFonts w:ascii="Calibri" w:hAnsi="Calibri"/>
+                <w:sz w:val="22"/>
+              </w:rPr>
+              <w:t>a state of hopelessness and despair</w:t>
+            </w:r>
+          </w:p>
+        </w:tc>
+        <w:tc>
+          <w:tcPr>
+            <w:tcW w:type="dxa" w:w="720"/>
+          </w:tcPr>
+          <w:p>
+            <w:r>
+              <w:rPr>
+                <w:rFonts w:ascii="Calibri" w:hAnsi="Calibri"/>
+                <w:sz w:val="22"/>
+              </w:rPr>
+              <w:t>R</w:t>
             </w:r>
           </w:p>
         </w:tc>
@@ -1154,7 +1502,7 @@
                 <w:rFonts w:ascii="Calibri" w:hAnsi="Calibri"/>
                 <w:sz w:val="22"/>
               </w:rPr>
-              <w:t>O</w:t>
+              <w:t>I</w:t>
             </w:r>
           </w:p>
         </w:tc>
@@ -1168,7 +1516,7 @@
                 <w:rFonts w:ascii="Calibri" w:hAnsi="Calibri"/>
                 <w:sz w:val="22"/>
               </w:rPr>
-              <w:t>the act of digging to find things underground</w:t>
+              <w:t>active during the night</w:t>
             </w:r>
           </w:p>
         </w:tc>
@@ -1182,7 +1530,7 @@
                 <w:rFonts w:ascii="Calibri" w:hAnsi="Calibri"/>
                 <w:sz w:val="22"/>
               </w:rPr>
-              <w:t>B</w:t>
+              <w:t>S</w:t>
             </w:r>
           </w:p>
         </w:tc>
@@ -1196,65 +1544,7 @@
                 <w:rFonts w:ascii="Calibri" w:hAnsi="Calibri"/>
                 <w:sz w:val="22"/>
               </w:rPr>
-              <w:t>stories, or the way a story is told</w:t>
-            </w:r>
-          </w:p>
-        </w:tc>
-      </w:tr>
-      <w:tr>
-        <w:tc>
-          <w:tcPr>
-            <w:tcW w:type="dxa" w:w="720"/>
-          </w:tcPr>
-          <w:p>
-            <w:r>
-              <w:rPr>
-                <w:rFonts w:ascii="Calibri" w:hAnsi="Calibri"/>
-                <w:sz w:val="22"/>
-              </w:rPr>
-              <w:t>E</w:t>
-            </w:r>
-          </w:p>
-        </w:tc>
-        <w:tc>
-          <w:tcPr>
-            <w:tcW w:type="dxa" w:w="4752"/>
-          </w:tcPr>
-          <w:p>
-            <w:r>
-              <w:rPr>
-                <w:rFonts w:ascii="Calibri" w:hAnsi="Calibri"/>
-                <w:sz w:val="22"/>
-              </w:rPr>
-              <w:t>the ability to produce new and original ideas</w:t>
-            </w:r>
-          </w:p>
-        </w:tc>
-        <w:tc>
-          <w:tcPr>
-            <w:tcW w:type="dxa" w:w="720"/>
-          </w:tcPr>
-          <w:p>
-            <w:r>
-              <w:rPr>
-                <w:rFonts w:ascii="Calibri" w:hAnsi="Calibri"/>
-                <w:sz w:val="22"/>
-              </w:rPr>
-              <w:t>L</w:t>
-            </w:r>
-          </w:p>
-        </w:tc>
-        <w:tc>
-          <w:tcPr>
-            <w:tcW w:type="dxa" w:w="4752"/>
-          </w:tcPr>
-          <w:p>
-            <w:r>
-              <w:rPr>
-                <w:rFonts w:ascii="Calibri" w:hAnsi="Calibri"/>
-                <w:sz w:val="22"/>
-              </w:rPr>
-              <w:t>not clearly or fully known</w:t>
+              <w:t>results or effects of an action</w:t>
             </w:r>
           </w:p>
         </w:tc>
@@ -1284,7 +1574,7 @@
                 <w:rFonts w:ascii="Calibri" w:hAnsi="Calibri"/>
                 <w:sz w:val="22"/>
               </w:rPr>
-              <w:t>covering a large area or a wide range</w:t>
+              <w:t>the ability to produce new and original ideas</w:t>
             </w:r>
           </w:p>
         </w:tc>
@@ -1298,239 +1588,7 @@
                 <w:rFonts w:ascii="Calibri" w:hAnsi="Calibri"/>
                 <w:sz w:val="22"/>
               </w:rPr>
-              <w:t>C</w:t>
-            </w:r>
-          </w:p>
-        </w:tc>
-        <w:tc>
-          <w:tcPr>
-            <w:tcW w:type="dxa" w:w="4752"/>
-          </w:tcPr>
-          <w:p>
-            <w:r>
-              <w:rPr>
-                <w:rFonts w:ascii="Calibri" w:hAnsi="Calibri"/>
-                <w:sz w:val="22"/>
-              </w:rPr>
-              <w:t>detailed information telling you how to do something</w:t>
-            </w:r>
-          </w:p>
-        </w:tc>
-      </w:tr>
-      <w:tr>
-        <w:tc>
-          <w:tcPr>
-            <w:tcW w:type="dxa" w:w="720"/>
-          </w:tcPr>
-          <w:p>
-            <w:r>
-              <w:rPr>
-                <w:rFonts w:ascii="Calibri" w:hAnsi="Calibri"/>
-                <w:sz w:val="22"/>
-              </w:rPr>
-              <w:t>N</w:t>
-            </w:r>
-          </w:p>
-        </w:tc>
-        <w:tc>
-          <w:tcPr>
-            <w:tcW w:type="dxa" w:w="4752"/>
-          </w:tcPr>
-          <w:p>
-            <w:r>
-              <w:rPr>
-                <w:rFonts w:ascii="Calibri" w:hAnsi="Calibri"/>
-                <w:sz w:val="22"/>
-              </w:rPr>
-              <w:t>dug out from the ground; discovered</w:t>
-            </w:r>
-          </w:p>
-        </w:tc>
-        <w:tc>
-          <w:tcPr>
-            <w:tcW w:type="dxa" w:w="720"/>
-          </w:tcPr>
-          <w:p>
-            <w:r>
-              <w:rPr>
-                <w:rFonts w:ascii="Calibri" w:hAnsi="Calibri"/>
-                <w:sz w:val="22"/>
-              </w:rPr>
-              <w:t>Q</w:t>
-            </w:r>
-          </w:p>
-        </w:tc>
-        <w:tc>
-          <w:tcPr>
-            <w:tcW w:type="dxa" w:w="4752"/>
-          </w:tcPr>
-          <w:p>
-            <w:r>
-              <w:rPr>
-                <w:rFonts w:ascii="Calibri" w:hAnsi="Calibri"/>
-                <w:sz w:val="22"/>
-              </w:rPr>
-              <w:t>a state of hopelessness and despair</w:t>
-            </w:r>
-          </w:p>
-        </w:tc>
-      </w:tr>
-      <w:tr>
-        <w:tc>
-          <w:tcPr>
-            <w:tcW w:type="dxa" w:w="720"/>
-          </w:tcPr>
-          <w:p>
-            <w:r>
-              <w:rPr>
-                <w:rFonts w:ascii="Calibri" w:hAnsi="Calibri"/>
-                <w:sz w:val="22"/>
-              </w:rPr>
-              <w:t>P</w:t>
-            </w:r>
-          </w:p>
-        </w:tc>
-        <w:tc>
-          <w:tcPr>
-            <w:tcW w:type="dxa" w:w="4752"/>
-          </w:tcPr>
-          <w:p>
-            <w:r>
-              <w:rPr>
-                <w:rFonts w:ascii="Calibri" w:hAnsi="Calibri"/>
-                <w:sz w:val="22"/>
-              </w:rPr>
-              <w:t>the period following a damaging or important event</w:t>
-            </w:r>
-          </w:p>
-        </w:tc>
-        <w:tc>
-          <w:tcPr>
-            <w:tcW w:type="dxa" w:w="720"/>
-          </w:tcPr>
-          <w:p>
-            <w:r>
-              <w:rPr>
-                <w:rFonts w:ascii="Calibri" w:hAnsi="Calibri"/>
-                <w:sz w:val="22"/>
-              </w:rPr>
-              <w:t>H</w:t>
-            </w:r>
-          </w:p>
-        </w:tc>
-        <w:tc>
-          <w:tcPr>
-            <w:tcW w:type="dxa" w:w="4752"/>
-          </w:tcPr>
-          <w:p>
-            <w:r>
-              <w:rPr>
-                <w:rFonts w:ascii="Calibri" w:hAnsi="Calibri"/>
-                <w:sz w:val="22"/>
-              </w:rPr>
-              <w:t>results or effects of an action</w:t>
-            </w:r>
-          </w:p>
-        </w:tc>
-      </w:tr>
-      <w:tr>
-        <w:tc>
-          <w:tcPr>
-            <w:tcW w:type="dxa" w:w="720"/>
-          </w:tcPr>
-          <w:p>
-            <w:r>
-              <w:rPr>
-                <w:rFonts w:ascii="Calibri" w:hAnsi="Calibri"/>
-                <w:sz w:val="22"/>
-              </w:rPr>
-              <w:t>S</w:t>
-            </w:r>
-          </w:p>
-        </w:tc>
-        <w:tc>
-          <w:tcPr>
-            <w:tcW w:type="dxa" w:w="4752"/>
-          </w:tcPr>
-          <w:p>
-            <w:r>
-              <w:rPr>
-                <w:rFonts w:ascii="Calibri" w:hAnsi="Calibri"/>
-                <w:sz w:val="22"/>
-              </w:rPr>
-              <w:t>acts of revealing or making something known</w:t>
-            </w:r>
-          </w:p>
-        </w:tc>
-        <w:tc>
-          <w:tcPr>
-            <w:tcW w:type="dxa" w:w="720"/>
-          </w:tcPr>
-          <w:p>
-            <w:r>
-              <w:rPr>
-                <w:rFonts w:ascii="Calibri" w:hAnsi="Calibri"/>
-                <w:sz w:val="22"/>
-              </w:rPr>
-              <w:t>I</w:t>
-            </w:r>
-          </w:p>
-        </w:tc>
-        <w:tc>
-          <w:tcPr>
-            <w:tcW w:type="dxa" w:w="4752"/>
-          </w:tcPr>
-          <w:p>
-            <w:r>
-              <w:rPr>
-                <w:rFonts w:ascii="Calibri" w:hAnsi="Calibri"/>
-                <w:sz w:val="22"/>
-              </w:rPr>
-              <w:t>intended to keep someone safe from harm or damage</w:t>
-            </w:r>
-          </w:p>
-        </w:tc>
-      </w:tr>
-      <w:tr>
-        <w:tc>
-          <w:tcPr>
-            <w:tcW w:type="dxa" w:w="720"/>
-          </w:tcPr>
-          <w:p>
-            <w:r>
-              <w:rPr>
-                <w:rFonts w:ascii="Calibri" w:hAnsi="Calibri"/>
-                <w:sz w:val="22"/>
-              </w:rPr>
-              <w:t>G</w:t>
-            </w:r>
-          </w:p>
-        </w:tc>
-        <w:tc>
-          <w:tcPr>
-            <w:tcW w:type="dxa" w:w="4752"/>
-          </w:tcPr>
-          <w:p>
-            <w:r>
-              <w:rPr>
-                <w:rFonts w:ascii="Calibri" w:hAnsi="Calibri"/>
-                <w:sz w:val="22"/>
-              </w:rPr>
-              <w:t>the combination of qualities that make someone different from others</w:t>
-            </w:r>
-          </w:p>
-        </w:tc>
-        <w:tc>
-          <w:tcPr>
-            <w:tcW w:type="dxa" w:w="720"/>
-          </w:tcPr>
-          <w:p>
-            <w:r>
-              <w:rPr>
-                <w:rFonts w:ascii="Calibri" w:hAnsi="Calibri"/>
-                <w:sz w:val="22"/>
-              </w:rPr>
-              <w:t>A</w:t>
+              <w:t>T</w:t>
             </w:r>
           </w:p>
         </w:tc>
@@ -1545,64 +1603,6 @@
                 <w:sz w:val="22"/>
               </w:rPr>
               <w:t>brought into a country from another country</w:t>
-            </w:r>
-          </w:p>
-        </w:tc>
-      </w:tr>
-      <w:tr>
-        <w:tc>
-          <w:tcPr>
-            <w:tcW w:type="dxa" w:w="720"/>
-          </w:tcPr>
-          <w:p>
-            <w:r>
-              <w:rPr>
-                <w:rFonts w:ascii="Calibri" w:hAnsi="Calibri"/>
-                <w:sz w:val="22"/>
-              </w:rPr>
-              <w:t>M</w:t>
-            </w:r>
-          </w:p>
-        </w:tc>
-        <w:tc>
-          <w:tcPr>
-            <w:tcW w:type="dxa" w:w="4752"/>
-          </w:tcPr>
-          <w:p>
-            <w:r>
-              <w:rPr>
-                <w:rFonts w:ascii="Calibri" w:hAnsi="Calibri"/>
-                <w:sz w:val="22"/>
-              </w:rPr>
-              <w:t>small broken pieces of something larger</w:t>
-            </w:r>
-          </w:p>
-        </w:tc>
-        <w:tc>
-          <w:tcPr>
-            <w:tcW w:type="dxa" w:w="720"/>
-          </w:tcPr>
-          <w:p>
-            <w:r>
-              <w:rPr>
-                <w:rFonts w:ascii="Calibri" w:hAnsi="Calibri"/>
-                <w:sz w:val="22"/>
-              </w:rPr>
-              <w:t>D</w:t>
-            </w:r>
-          </w:p>
-        </w:tc>
-        <w:tc>
-          <w:tcPr>
-            <w:tcW w:type="dxa" w:w="4752"/>
-          </w:tcPr>
-          <w:p>
-            <w:r>
-              <w:rPr>
-                <w:rFonts w:ascii="Calibri" w:hAnsi="Calibri"/>
-                <w:sz w:val="22"/>
-              </w:rPr>
-              <w:t>a planned set of activities to achieve a goal</w:t>
             </w:r>
           </w:p>
         </w:tc>

</xml_diff>